<commit_message>
list punctuation version B
</commit_message>
<xml_diff>
--- a/templates/list-punctuation-version-a.docx
+++ b/templates/list-punctuation-version-a.docx
@@ -4,80 +4,136 @@
   <w:body>
     <w:p>
       <w:r>
-        <w:t xml:space="preserve">This template uses Version A of list </w:t>
-      </w:r>
-      <w:proofErr w:type="gramStart"/>
-      <w:r>
-        <w:t>punctuating</w:t>
-      </w:r>
-      <w:proofErr w:type="gramEnd"/>
-      <w:r>
-        <w:t>.</w:t>
+        <w:t xml:space="preserve">This template uses </w:t>
+      </w:r>
+      <w:r>
+        <w:rPr>
+          <w:b/>
+          <w:bCs/>
+        </w:rPr>
+        <w:t>Version A</w:t>
+      </w:r>
+      <w:r>
+        <w:t xml:space="preserve"> of list punctuating.</w:t>
       </w:r>
     </w:p>
     <w:p>
       <w:r>
-        <w:t>{#</w:t>
-      </w:r>
-      <w:proofErr w:type="gramStart"/>
-      <w:r>
-        <w:t>people}{</w:t>
-      </w:r>
-      <w:proofErr w:type="gramEnd"/>
-      <w:r>
-        <w:t xml:space="preserve">name} is {age} years </w:t>
-      </w:r>
-      <w:proofErr w:type="gramStart"/>
-      <w:r>
-        <w:t>old{</w:t>
-      </w:r>
-      <w:proofErr w:type="gramEnd"/>
-      <w:r>
-        <w:t xml:space="preserve">$index === </w:t>
-      </w:r>
-      <w:proofErr w:type="spellStart"/>
-      <w:proofErr w:type="gramStart"/>
-      <w:r>
-        <w:t>people.length</w:t>
-      </w:r>
-      <w:proofErr w:type="spellEnd"/>
-      <w:proofErr w:type="gramEnd"/>
-      <w:r>
-        <w:t xml:space="preserve"> – 2} and {</w:t>
-      </w:r>
-      <w:proofErr w:type="gramStart"/>
-      <w:r>
-        <w:t>/}{</w:t>
-      </w:r>
-      <w:proofErr w:type="gramEnd"/>
-      <w:r>
-        <w:t xml:space="preserve">$index &lt; </w:t>
-      </w:r>
-      <w:proofErr w:type="spellStart"/>
-      <w:proofErr w:type="gramStart"/>
-      <w:r>
-        <w:t>people.length</w:t>
-      </w:r>
-      <w:proofErr w:type="spellEnd"/>
-      <w:proofErr w:type="gramEnd"/>
-      <w:r>
-        <w:t xml:space="preserve"> -</w:t>
-      </w:r>
-      <w:proofErr w:type="gramStart"/>
-      <w:r>
-        <w:t>2 }</w:t>
-      </w:r>
-      <w:proofErr w:type="gramEnd"/>
-      <w:r>
-        <w:t>; {</w:t>
-      </w:r>
-      <w:proofErr w:type="gramStart"/>
-      <w:r>
-        <w:t>/}{</w:t>
-      </w:r>
-      <w:proofErr w:type="gramEnd"/>
-      <w:r>
-        <w:t>/}, and they all lived happily ever after.</w:t>
+        <w:t>{</w:t>
+      </w:r>
+      <w:r>
+        <w:rPr>
+          <w:color w:val="E97132" w:themeColor="accent2"/>
+        </w:rPr>
+        <w:t>#people</w:t>
+      </w:r>
+      <w:r>
+        <w:t>}</w:t>
+      </w:r>
+      <w:r>
+        <w:t>{</w:t>
+      </w:r>
+      <w:r>
+        <w:rPr>
+          <w:color w:val="45B0E1" w:themeColor="accent1" w:themeTint="99"/>
+        </w:rPr>
+        <w:t>name</w:t>
+      </w:r>
+      <w:r>
+        <w:t>}</w:t>
+      </w:r>
+      <w:r>
+        <w:t xml:space="preserve"> is </w:t>
+      </w:r>
+      <w:r>
+        <w:t>{</w:t>
+      </w:r>
+      <w:r>
+        <w:rPr>
+          <w:color w:val="45B0E1" w:themeColor="accent1" w:themeTint="99"/>
+        </w:rPr>
+        <w:t>age</w:t>
+      </w:r>
+      <w:r>
+        <w:t>}</w:t>
+      </w:r>
+      <w:r>
+        <w:t xml:space="preserve"> years old</w:t>
+      </w:r>
+      <w:r>
+        <w:t>{</w:t>
+      </w:r>
+      <w:r>
+        <w:rPr>
+          <w:color w:val="4EA72E" w:themeColor="accent6"/>
+        </w:rPr>
+        <w:t xml:space="preserve">#$index &lt; people.length - </w:t>
+      </w:r>
+      <w:r>
+        <w:rPr>
+          <w:color w:val="4EA72E" w:themeColor="accent6"/>
+        </w:rPr>
+        <w:t>1</w:t>
+      </w:r>
+      <w:r>
+        <w:t xml:space="preserve">}; </w:t>
+      </w:r>
+      <w:r>
+        <w:t>{</w:t>
+      </w:r>
+      <w:r>
+        <w:rPr>
+          <w:color w:val="4EA72E" w:themeColor="accent6"/>
+        </w:rPr>
+        <w:t>/</w:t>
+      </w:r>
+      <w:r>
+        <w:t>}</w:t>
+      </w:r>
+      <w:r>
+        <w:t>{</w:t>
+      </w:r>
+      <w:r>
+        <w:rPr>
+          <w:color w:val="4EA72E" w:themeColor="accent6"/>
+        </w:rPr>
+        <w:t xml:space="preserve">#$index == people.length - </w:t>
+      </w:r>
+      <w:r>
+        <w:rPr>
+          <w:color w:val="4EA72E" w:themeColor="accent6"/>
+        </w:rPr>
+        <w:t>2</w:t>
+      </w:r>
+      <w:r>
+        <w:t>}and {</w:t>
+      </w:r>
+      <w:r>
+        <w:rPr>
+          <w:color w:val="4EA72E" w:themeColor="accent6"/>
+        </w:rPr>
+        <w:t>/</w:t>
+      </w:r>
+      <w:r>
+        <w:t>}</w:t>
+      </w:r>
+      <w:r>
+        <w:t>{</w:t>
+      </w:r>
+      <w:r>
+        <w:rPr>
+          <w:color w:val="E97132" w:themeColor="accent2"/>
+        </w:rPr>
+        <w:t>/</w:t>
+      </w:r>
+      <w:r>
+        <w:rPr>
+          <w:color w:val="E97132" w:themeColor="accent2"/>
+        </w:rPr>
+        <w:t>people</w:t>
+      </w:r>
+      <w:r>
+        <w:t>}, and they all lived happily ever after.</w:t>
       </w:r>
     </w:p>
     <w:p>
@@ -1012,6 +1068,36 @@
       <w:spacing w:val="5"/>
     </w:rPr>
   </w:style>
+  <w:style w:type="paragraph" w:styleId="HTMLPreformatted">
+    <w:name w:val="HTML Preformatted"/>
+    <w:basedOn w:val="Normal"/>
+    <w:link w:val="HTMLPreformattedChar"/>
+    <w:uiPriority w:val="99"/>
+    <w:semiHidden/>
+    <w:unhideWhenUsed/>
+    <w:rsid w:val="004D0494"/>
+    <w:pPr>
+      <w:spacing w:after="0" w:line="240" w:lineRule="auto"/>
+    </w:pPr>
+    <w:rPr>
+      <w:rFonts w:ascii="Consolas" w:hAnsi="Consolas"/>
+      <w:sz w:val="20"/>
+      <w:szCs w:val="20"/>
+    </w:rPr>
+  </w:style>
+  <w:style w:type="character" w:customStyle="1" w:styleId="HTMLPreformattedChar">
+    <w:name w:val="HTML Preformatted Char"/>
+    <w:basedOn w:val="DefaultParagraphFont"/>
+    <w:link w:val="HTMLPreformatted"/>
+    <w:uiPriority w:val="99"/>
+    <w:semiHidden/>
+    <w:rsid w:val="004D0494"/>
+    <w:rPr>
+      <w:rFonts w:ascii="Consolas" w:hAnsi="Consolas"/>
+      <w:sz w:val="20"/>
+      <w:szCs w:val="20"/>
+    </w:rPr>
+  </w:style>
 </w:styles>
 </file>
 

</xml_diff>